<commit_message>
Ajuste no termo de reajuste para colocar em negrito
</commit_message>
<xml_diff>
--- a/plennuscApp/public/uploadgestao/docs/youBut/HAPVIDA_TERMO_DE_REAJUSTE.docx
+++ b/plennuscApp/public/uploadgestao/docs/youBut/HAPVIDA_TERMO_DE_REAJUSTE.docx
@@ -3996,23 +3996,6 @@
     </w:p>
     <w:p>
       <w:pPr>
-        <w:jc w:val="both"/>
-      </w:pPr>
-    </w:p>
-    <w:p>
-      <w:pPr>
-        <w:ind w:right="566"/>
-        <w:jc w:val="both"/>
-      </w:pPr>
-    </w:p>
-    <w:p>
-      <w:pPr>
-        <w:ind w:right="566"/>
-        <w:jc w:val="both"/>
-      </w:pPr>
-    </w:p>
-    <w:p>
-      <w:pPr>
         <w:ind w:right="566"/>
         <w:jc w:val="both"/>
       </w:pPr>
@@ -4713,331 +4696,6 @@
         <w:jc w:val="center"/>
       </w:pPr>
     </w:p>
-    <w:tbl>
-      <w:tblPr>
-        <w:tblStyle w:val="Tabelacomgrade"/>
-        <w:tblpPr w:leftFromText="141" w:rightFromText="141" w:vertAnchor="page" w:horzAnchor="margin" w:tblpY="4291"/>
-        <w:tblW w:w="9963" w:type="dxa"/>
-        <w:tblLook w:val="04A0" w:firstRow="1" w:lastRow="0" w:firstColumn="1" w:lastColumn="0" w:noHBand="0" w:noVBand="1"/>
-      </w:tblPr>
-      <w:tblGrid>
-        <w:gridCol w:w="1978"/>
-        <w:gridCol w:w="1979"/>
-        <w:gridCol w:w="1978"/>
-        <w:gridCol w:w="1980"/>
-        <w:gridCol w:w="2048"/>
-      </w:tblGrid>
-      <w:tr>
-        <w:trPr>
-          <w:trHeight w:val="332"/>
-        </w:trPr>
-        <w:tc>
-          <w:tcPr>
-            <w:tcW w:w="1978" w:type="dxa"/>
-            <w:vAlign w:val="center"/>
-          </w:tcPr>
-          <w:p>
-            <w:pPr>
-              <w:jc w:val="center"/>
-              <w:rPr>
-                <w:rFonts w:cs="Arial"/>
-                <w:b/>
-                <w:sz w:val="18"/>
-                <w:szCs w:val="18"/>
-              </w:rPr>
-            </w:pPr>
-            <w:r>
-              <w:rPr>
-                <w:rFonts w:cs="Arial"/>
-                <w:b/>
-                <w:sz w:val="18"/>
-                <w:szCs w:val="18"/>
-              </w:rPr>
-              <w:t xml:space="preserve">DEPENDENTE </w:t>
-            </w:r>
-            <w:r>
-              <w:rPr>
-                <w:rFonts w:cs="Arial"/>
-                <w:b/>
-                <w:sz w:val="18"/>
-                <w:szCs w:val="18"/>
-              </w:rPr>
-              <w:t>5</w:t>
-            </w:r>
-            <w:r>
-              <w:rPr>
-                <w:rFonts w:cs="Arial"/>
-                <w:b/>
-                <w:sz w:val="18"/>
-                <w:szCs w:val="18"/>
-              </w:rPr>
-              <w:t xml:space="preserve"> (R$)</w:t>
-            </w:r>
-          </w:p>
-        </w:tc>
-        <w:tc>
-          <w:tcPr>
-            <w:tcW w:w="1979" w:type="dxa"/>
-            <w:vAlign w:val="center"/>
-          </w:tcPr>
-          <w:p>
-            <w:pPr>
-              <w:jc w:val="center"/>
-              <w:rPr>
-                <w:rFonts w:cs="Arial"/>
-                <w:b/>
-                <w:sz w:val="18"/>
-                <w:szCs w:val="18"/>
-              </w:rPr>
-            </w:pPr>
-            <w:r>
-              <w:rPr>
-                <w:rFonts w:cs="Arial"/>
-                <w:b/>
-                <w:sz w:val="18"/>
-                <w:szCs w:val="18"/>
-              </w:rPr>
-              <w:t xml:space="preserve">DEPENDENTE </w:t>
-            </w:r>
-            <w:r>
-              <w:rPr>
-                <w:rFonts w:cs="Arial"/>
-                <w:b/>
-                <w:sz w:val="18"/>
-                <w:szCs w:val="18"/>
-              </w:rPr>
-              <w:t>6</w:t>
-            </w:r>
-            <w:r>
-              <w:rPr>
-                <w:rFonts w:cs="Arial"/>
-                <w:b/>
-                <w:sz w:val="18"/>
-                <w:szCs w:val="18"/>
-              </w:rPr>
-              <w:t xml:space="preserve"> (R$)</w:t>
-            </w:r>
-          </w:p>
-        </w:tc>
-        <w:tc>
-          <w:tcPr>
-            <w:tcW w:w="1978" w:type="dxa"/>
-            <w:vAlign w:val="center"/>
-          </w:tcPr>
-          <w:p>
-            <w:pPr>
-              <w:jc w:val="center"/>
-              <w:rPr>
-                <w:rFonts w:cs="Arial"/>
-                <w:b/>
-                <w:sz w:val="18"/>
-                <w:szCs w:val="18"/>
-              </w:rPr>
-            </w:pPr>
-            <w:r>
-              <w:rPr>
-                <w:rFonts w:cs="Arial"/>
-                <w:b/>
-                <w:sz w:val="18"/>
-                <w:szCs w:val="18"/>
-              </w:rPr>
-              <w:t xml:space="preserve">DEPENDENTE </w:t>
-            </w:r>
-            <w:r>
-              <w:rPr>
-                <w:rFonts w:cs="Arial"/>
-                <w:b/>
-                <w:sz w:val="18"/>
-                <w:szCs w:val="18"/>
-              </w:rPr>
-              <w:t>7</w:t>
-            </w:r>
-            <w:r>
-              <w:rPr>
-                <w:rFonts w:cs="Arial"/>
-                <w:b/>
-                <w:sz w:val="18"/>
-                <w:szCs w:val="18"/>
-              </w:rPr>
-              <w:t xml:space="preserve"> (R$)</w:t>
-            </w:r>
-          </w:p>
-        </w:tc>
-        <w:tc>
-          <w:tcPr>
-            <w:tcW w:w="1980" w:type="dxa"/>
-            <w:vAlign w:val="center"/>
-          </w:tcPr>
-          <w:p>
-            <w:pPr>
-              <w:jc w:val="center"/>
-              <w:rPr>
-                <w:rFonts w:cs="Arial"/>
-                <w:b/>
-                <w:sz w:val="18"/>
-                <w:szCs w:val="18"/>
-              </w:rPr>
-            </w:pPr>
-            <w:r>
-              <w:rPr>
-                <w:rFonts w:cs="Arial"/>
-                <w:b/>
-                <w:sz w:val="18"/>
-                <w:szCs w:val="18"/>
-              </w:rPr>
-              <w:t xml:space="preserve">DEPENDENTE </w:t>
-            </w:r>
-            <w:r>
-              <w:rPr>
-                <w:rFonts w:cs="Arial"/>
-                <w:b/>
-                <w:sz w:val="18"/>
-                <w:szCs w:val="18"/>
-              </w:rPr>
-              <w:t>8</w:t>
-            </w:r>
-            <w:r>
-              <w:rPr>
-                <w:rFonts w:cs="Arial"/>
-                <w:b/>
-                <w:sz w:val="18"/>
-                <w:szCs w:val="18"/>
-              </w:rPr>
-              <w:t xml:space="preserve"> (R$)</w:t>
-            </w:r>
-          </w:p>
-        </w:tc>
-        <w:tc>
-          <w:tcPr>
-            <w:tcW w:w="2048" w:type="dxa"/>
-            <w:vAlign w:val="center"/>
-          </w:tcPr>
-          <w:p>
-            <w:pPr>
-              <w:jc w:val="center"/>
-              <w:rPr>
-                <w:rFonts w:cs="Arial"/>
-                <w:b/>
-                <w:sz w:val="18"/>
-                <w:szCs w:val="18"/>
-              </w:rPr>
-            </w:pPr>
-            <w:r>
-              <w:rPr>
-                <w:rFonts w:cs="Arial"/>
-                <w:b/>
-                <w:sz w:val="18"/>
-                <w:szCs w:val="18"/>
-              </w:rPr>
-              <w:t xml:space="preserve">DEPENDENTE </w:t>
-            </w:r>
-            <w:r>
-              <w:rPr>
-                <w:rFonts w:cs="Arial"/>
-                <w:b/>
-                <w:sz w:val="18"/>
-                <w:szCs w:val="18"/>
-              </w:rPr>
-              <w:t>9</w:t>
-            </w:r>
-            <w:r>
-              <w:rPr>
-                <w:rFonts w:cs="Arial"/>
-                <w:b/>
-                <w:sz w:val="18"/>
-                <w:szCs w:val="18"/>
-              </w:rPr>
-              <w:t xml:space="preserve"> (R$)</w:t>
-            </w:r>
-          </w:p>
-        </w:tc>
-      </w:tr>
-      <w:tr>
-        <w:trPr>
-          <w:trHeight w:val="1064"/>
-        </w:trPr>
-        <w:tc>
-          <w:tcPr>
-            <w:tcW w:w="1978" w:type="dxa"/>
-            <w:vAlign w:val="center"/>
-          </w:tcPr>
-          <w:p>
-            <w:pPr>
-              <w:jc w:val="center"/>
-              <w:rPr>
-                <w:rFonts w:cs="Arial"/>
-                <w:sz w:val="18"/>
-                <w:szCs w:val="18"/>
-              </w:rPr>
-            </w:pPr>
-          </w:p>
-        </w:tc>
-        <w:tc>
-          <w:tcPr>
-            <w:tcW w:w="1979" w:type="dxa"/>
-            <w:vAlign w:val="center"/>
-          </w:tcPr>
-          <w:p>
-            <w:pPr>
-              <w:jc w:val="center"/>
-              <w:rPr>
-                <w:rFonts w:cs="Arial"/>
-                <w:sz w:val="18"/>
-                <w:szCs w:val="18"/>
-              </w:rPr>
-            </w:pPr>
-          </w:p>
-        </w:tc>
-        <w:tc>
-          <w:tcPr>
-            <w:tcW w:w="1978" w:type="dxa"/>
-            <w:vAlign w:val="center"/>
-          </w:tcPr>
-          <w:p>
-            <w:pPr>
-              <w:jc w:val="center"/>
-              <w:rPr>
-                <w:rFonts w:cs="Arial"/>
-                <w:sz w:val="18"/>
-                <w:szCs w:val="18"/>
-              </w:rPr>
-            </w:pPr>
-          </w:p>
-        </w:tc>
-        <w:tc>
-          <w:tcPr>
-            <w:tcW w:w="1980" w:type="dxa"/>
-            <w:vAlign w:val="center"/>
-          </w:tcPr>
-          <w:p>
-            <w:pPr>
-              <w:jc w:val="center"/>
-              <w:rPr>
-                <w:rFonts w:cs="Arial"/>
-                <w:sz w:val="18"/>
-                <w:szCs w:val="18"/>
-              </w:rPr>
-            </w:pPr>
-          </w:p>
-        </w:tc>
-        <w:tc>
-          <w:tcPr>
-            <w:tcW w:w="2048" w:type="dxa"/>
-            <w:vAlign w:val="center"/>
-          </w:tcPr>
-          <w:p>
-            <w:pPr>
-              <w:jc w:val="center"/>
-              <w:rPr>
-                <w:rFonts w:cs="Arial"/>
-                <w:sz w:val="18"/>
-                <w:szCs w:val="18"/>
-              </w:rPr>
-            </w:pPr>
-          </w:p>
-        </w:tc>
-      </w:tr>
-    </w:tbl>
     <w:p>
       <w:pPr>
         <w:jc w:val="center"/>

</xml_diff>